<commit_message>
Report: range test results added to Appendix C
Four measured rows join the record: full health at 3.26 mi (5.25 km)
with on-screen coordinates matching the displayed haversine, the
stale edge at 3.75 mi (6.03 km), the in-town 0.5 mi comparison, and
inbound reacquisition at 37 mph. Closing paragraph now states the
range model check passed with margin; Section 10 framing updated from
planned to executed. Still exactly 20 pages. Word version regenerated.

Co-Authored-By: Claude Fable 5 <noreply@anthropic.com>
</commit_message>
<xml_diff>
--- a/docs/reports/Group9_Technical_Report.docx
+++ b/docs/reports/Group9_Technical_Report.docx
@@ -3460,7 +3460,7 @@
         <w:jc w:val="both"/>
       </w:pPr>
       <w:r>
-        <w:t>The remaining planned verification is a two-vehicle drive test with acceptance metrics declared in advance, summarized in Table 3. Declaring the thresholds before the test, rather than after, is deliberate; it converts the drive from a demonstration into an experiment that can fail, which is the only kind that provides evidence.</w:t>
+        <w:t>The two-vehicle drive tests were run against acceptance metrics declared in advance, summarized in Table 3, with the measured outcomes recorded in Appendix C. Declaring the thresholds before the test, rather than after, is deliberate; it converts the drive from a demonstration into an experiment that can fail, which is the only kind that provides evidence. The range model check passed with margin: full tracking at 5.25 km against a 3 to 5 km design range.</w:t>
       </w:r>
     </w:p>
     <w:tbl>
@@ -6162,6 +6162,182 @@
           </w:p>
         </w:tc>
       </w:tr>
+      <w:tr>
+        <w:tc>
+          <w:tcPr>
+            <w:tcW w:type="dxa" w:w="3120"/>
+          </w:tcPr>
+          <w:p>
+            <w:r>
+              <w:rPr>
+                <w:rFonts w:ascii="Times New Roman" w:hAnsi="Times New Roman"/>
+                <w:sz w:val="20"/>
+              </w:rPr>
+              <w:t>Open-road range, full health</w:t>
+            </w:r>
+          </w:p>
+        </w:tc>
+        <w:tc>
+          <w:tcPr>
+            <w:tcW w:type="dxa" w:w="3120"/>
+          </w:tcPr>
+          <w:p>
+            <w:r>
+              <w:rPr>
+                <w:rFonts w:ascii="Times New Roman" w:hAnsi="Times New Roman"/>
+                <w:sz w:val="20"/>
+              </w:rPr>
+              <w:t>LINK CONNECTED at 3.26 mi (5.25 km), both coordinate sets live on screen; the displayed distance matches the latitude delta exactly (0.04719 deg = 3.26 mi)</w:t>
+            </w:r>
+          </w:p>
+        </w:tc>
+        <w:tc>
+          <w:tcPr>
+            <w:tcW w:type="dxa" w:w="3120"/>
+          </w:tcPr>
+          <w:p>
+            <w:r>
+              <w:rPr>
+                <w:rFonts w:ascii="Times New Roman" w:hAnsi="Times New Roman"/>
+                <w:sz w:val="20"/>
+              </w:rPr>
+              <w:t>2026-10-05, N County Road 2000; in-cabin antennas, partner parked; Find My ground truth 4.1 road miles</w:t>
+            </w:r>
+          </w:p>
+        </w:tc>
+      </w:tr>
+      <w:tr>
+        <w:tc>
+          <w:tcPr>
+            <w:tcW w:type="dxa" w:w="3120"/>
+          </w:tcPr>
+          <w:p>
+            <w:r>
+              <w:rPr>
+                <w:rFonts w:ascii="Times New Roman" w:hAnsi="Times New Roman"/>
+                <w:sz w:val="20"/>
+              </w:rPr>
+              <w:t>Open-road range, stale edge</w:t>
+            </w:r>
+          </w:p>
+        </w:tc>
+        <w:tc>
+          <w:tcPr>
+            <w:tcW w:type="dxa" w:w="3120"/>
+          </w:tcPr>
+          <w:p>
+            <w:r>
+              <w:rPr>
+                <w:rFonts w:ascii="Times New Roman" w:hAnsi="Times New Roman"/>
+                <w:sz w:val="20"/>
+              </w:rPr>
+              <w:t>DATA STALE at 3.75 mi (6.03 km), age 2 min, and a message send failed; flagged honestly on both devices</w:t>
+            </w:r>
+          </w:p>
+        </w:tc>
+        <w:tc>
+          <w:tcPr>
+            <w:tcW w:type="dxa" w:w="3120"/>
+          </w:tcPr>
+          <w:p>
+            <w:r>
+              <w:rPr>
+                <w:rFonts w:ascii="Times New Roman" w:hAnsi="Times New Roman"/>
+                <w:sz w:val="20"/>
+              </w:rPr>
+              <w:t>The reliable edge for this configuration, not a physics limit</w:t>
+            </w:r>
+          </w:p>
+        </w:tc>
+      </w:tr>
+      <w:tr>
+        <w:tc>
+          <w:tcPr>
+            <w:tcW w:type="dxa" w:w="3120"/>
+          </w:tcPr>
+          <w:p>
+            <w:r>
+              <w:rPr>
+                <w:rFonts w:ascii="Times New Roman" w:hAnsi="Times New Roman"/>
+                <w:sz w:val="20"/>
+              </w:rPr>
+              <w:t>In-town stale onset</w:t>
+            </w:r>
+          </w:p>
+        </w:tc>
+        <w:tc>
+          <w:tcPr>
+            <w:tcW w:type="dxa" w:w="3120"/>
+          </w:tcPr>
+          <w:p>
+            <w:r>
+              <w:rPr>
+                <w:rFonts w:ascii="Times New Roman" w:hAnsi="Times New Roman"/>
+                <w:sz w:val="20"/>
+              </w:rPr>
+              <w:t>Near 0.5 mi with the same hardware</w:t>
+            </w:r>
+          </w:p>
+        </w:tc>
+        <w:tc>
+          <w:tcPr>
+            <w:tcW w:type="dxa" w:w="3120"/>
+          </w:tcPr>
+          <w:p>
+            <w:r>
+              <w:rPr>
+                <w:rFonts w:ascii="Times New Roman" w:hAnsi="Times New Roman"/>
+                <w:sz w:val="20"/>
+              </w:rPr>
+              <w:t>2026-10-04 night drive; a factor of seven from environment alone</w:t>
+            </w:r>
+          </w:p>
+        </w:tc>
+      </w:tr>
+      <w:tr>
+        <w:tc>
+          <w:tcPr>
+            <w:tcW w:type="dxa" w:w="3120"/>
+          </w:tcPr>
+          <w:p>
+            <w:r>
+              <w:rPr>
+                <w:rFonts w:ascii="Times New Roman" w:hAnsi="Times New Roman"/>
+                <w:sz w:val="20"/>
+              </w:rPr>
+              <w:t>Reacquisition inbound</w:t>
+            </w:r>
+          </w:p>
+        </w:tc>
+        <w:tc>
+          <w:tcPr>
+            <w:tcW w:type="dxa" w:w="3120"/>
+          </w:tcPr>
+          <w:p>
+            <w:r>
+              <w:rPr>
+                <w:rFonts w:ascii="Times New Roman" w:hAnsi="Times New Roman"/>
+                <w:sz w:val="20"/>
+              </w:rPr>
+              <w:t>Ages back in the teens by 0.85 mi; dart at 12 o'clock at 37 mph, no operator action</w:t>
+            </w:r>
+          </w:p>
+        </w:tc>
+        <w:tc>
+          <w:tcPr>
+            <w:tcW w:type="dxa" w:w="3120"/>
+          </w:tcPr>
+          <w:p>
+            <w:r>
+              <w:rPr>
+                <w:rFonts w:ascii="Times New Roman" w:hAnsi="Times New Roman"/>
+                <w:sz w:val="20"/>
+              </w:rPr>
+              <w:t>Return leg of the range test</w:t>
+            </w:r>
+          </w:p>
+        </w:tc>
+      </w:tr>
     </w:tbl>
     <w:p>
       <w:pPr>
@@ -6176,7 +6352,7 @@
         <w:rPr>
           <w:sz w:val="21"/>
         </w:rPr>
-        <w:t>Table 4. Bench measurement record. Desk-range SNR values are not range claims; they anchor the margin arithmetic of Section 5.</w:t>
+        <w:t>Table 4. Bench and road measurement record. Desk-range SNR values are not range claims; they anchor the margin arithmetic of Section 5.</w:t>
       </w:r>
     </w:p>
     <w:p>
@@ -6184,7 +6360,7 @@
         <w:jc w:val="both"/>
       </w:pPr>
       <w:r>
-        <w:t>One figure deserves repetition because it ties the record together. The 6 dB desk-range SNR sits 23.5 dB above the -17.5 dB demodulation floor, and by the doubling rule of Section 5 that reserve corresponds to roughly four successive doublings of distance before the link fails, which is the quantitative basis for believing the 3 to 5 km design range before the formal range test of Table 3 has been driven.</w:t>
+        <w:t>Two figures tie the record together. The 6 dB desk-range SNR sits 23.5 dB above the -17.5 dB demodulation floor, roughly four distance doublings of reserve by the rule of Section 5, which was the basis for believing the 3 to 5 km design range in advance. The road then agreed: the 2026-10-05 range test measured full health at 5.25 km and the reliable edge by 6.03 km with antennas still inside the vehicles, meeting the top of the design range and exceeding it by about a kilometer. This satisfies the range model check of Table 3, and the in-town versus open-road comparison, 0.5 mi against 3.75 mi on identical hardware, is the 20 dB environmental reserve made directly visible.</w:t>
       </w:r>
     </w:p>
     <w:p>

</xml_diff>

<commit_message>
Technical report: member credits on section titles, division-of-work note, page numbers, margin fix
Co-Authored-By: Claude Fable 5 <noreply@anthropic.com>
</commit_message>
<xml_diff>
--- a/docs/reports/Group9_Technical_Report.docx
+++ b/docs/reports/Group9_Technical_Report.docx
@@ -67,6 +67,13 @@
           <w:sz w:val="24"/>
         </w:rPr>
         <w:t>Group 9</w:t>
+        <w:br/>
+      </w:r>
+      <w:r>
+        <w:rPr>
+          <w:sz w:val="24"/>
+        </w:rPr>
+        <w:t>Deo · Josiah · Victor · Cannon</w:t>
         <w:br/>
       </w:r>
       <w:r>
@@ -267,6 +274,14 @@
       </w:pPr>
       <w:r>
         <w:t>Every design decision in the following sections either establishes one of those agreements, budgets the physical resources that keep the agreement usable, or displays the agreed information honestly to a driver. Section 2 defines the architecture. Sections 3 through 5 build the radio node and its physical layer from the datasheet upward, in the same order the signal itself is built. Section 6 explains the protocol layer that turns raw packets into a private, self-managing channel. Sections 7 and 8 cross into the display node and the navigation mathematics it computes. Section 9 presents the failures encountered on real hardware and the rules they taught, Section 10 reports the experimental verification, Section 11 outlines future work, and Section 12 concludes.</w:t>
+      </w:r>
+    </w:p>
+    <w:p>
+      <w:pPr>
+        <w:jc w:val="both"/>
+      </w:pPr>
+      <w:r>
+        <w:t>The work described here was divided among the four members of Group 9, and each technical section below carries the name of the member responsible for that part of the system. Victor, the radio and hardware lead, configured the radios and characterized the physical layer (Sections 3 and 4). Cannon, the systems and test lead, built the measurement harness behind the link budget and led the drive testing (Sections 5 and 10, the latter jointly with Victor). Deo wrote the protocol firmware, including the Bluetooth client and packet decoding that connect the two nodes (Section 6 and Section 7.2). Josiah wrote the display and navigation firmware that turns decoded packets into the driver's screen (Sections 7 and 8). The remaining sections, including the architecture, the failure catalog, and this introduction, are joint work.</w:t>
       </w:r>
     </w:p>
     <w:p>
@@ -1025,7 +1040,7 @@
           <w:b/>
           <w:sz w:val="30"/>
         </w:rPr>
-        <w:t>3. The Radio Node: Heltec WiFi LoRa 32 V4</w:t>
+        <w:t>3. The Radio Node: Heltec WiFi LoRa 32 V4 (Victor)</w:t>
       </w:r>
     </w:p>
     <w:p>
@@ -1178,7 +1193,7 @@
           <w:b/>
           <w:sz w:val="30"/>
         </w:rPr>
-        <w:t>4. The Physical Layer: LoRa Chirp Spread Spectrum</w:t>
+        <w:t>4. The Physical Layer: LoRa Chirp Spread Spectrum (Victor)</w:t>
       </w:r>
     </w:p>
     <w:p>
@@ -1383,7 +1398,7 @@
           <w:b/>
           <w:sz w:val="30"/>
         </w:rPr>
-        <w:t>5. The Link Budget: From Datasheet Numbers to Street Range</w:t>
+        <w:t>5. The Link Budget: From Datasheet Numbers to Street Range (Cannon)</w:t>
       </w:r>
     </w:p>
     <w:p>
@@ -1536,7 +1551,7 @@
           <w:b/>
           <w:sz w:val="30"/>
         </w:rPr>
-        <w:t>6. The Protocol Layer: Meshtastic and the Channel Contract</w:t>
+        <w:t>6. The Protocol Layer: Meshtastic and the Channel Contract (Deo)</w:t>
       </w:r>
     </w:p>
     <w:p>
@@ -2354,7 +2369,7 @@
           <w:b/>
           <w:sz w:val="30"/>
         </w:rPr>
-        <w:t>7. The Display Node: Waveshare ESP32-S3-RLCD-4.2</w:t>
+        <w:t>7. The Display Node: Waveshare ESP32-S3-RLCD-4.2 (Josiah)</w:t>
       </w:r>
     </w:p>
     <w:p>
@@ -2756,7 +2771,7 @@
           <w:b/>
           <w:sz w:val="30"/>
         </w:rPr>
-        <w:t>8. Navigation Mathematics</w:t>
+        <w:t>8. Navigation Mathematics (Josiah)</w:t>
       </w:r>
     </w:p>
     <w:p>
@@ -3016,7 +3031,7 @@
           <w:b/>
           <w:sz w:val="30"/>
         </w:rPr>
-        <w:t>10. Experimental Verification</w:t>
+        <w:t>10. Experimental Verification (Victor and Cannon)</w:t>
       </w:r>
     </w:p>
     <w:p>

</xml_diff>

<commit_message>
Report: realistic future work (testing, manuals, NM and canyon range tests); remove display photos
Co-Authored-By: Claude Fable 5 <noreply@anthropic.com>
</commit_message>
<xml_diff>
--- a/docs/reports/Group9_Technical_Report.docx
+++ b/docs/reports/Group9_Technical_Report.docx
@@ -2674,96 +2674,6 @@
     </w:p>
     <w:p>
       <w:pPr>
-        <w:jc w:val="center"/>
-      </w:pPr>
-      <w:r>
-        <w:drawing>
-          <wp:inline xmlns:a="http://schemas.openxmlformats.org/drawingml/2006/main" xmlns:pic="http://schemas.openxmlformats.org/drawingml/2006/picture">
-            <wp:extent cx="2148840" cy="1670723"/>
-            <wp:docPr id="14" name="Picture 14"/>
-            <wp:cNvGraphicFramePr>
-              <a:graphicFrameLocks noChangeAspect="1"/>
-            </wp:cNvGraphicFramePr>
-            <a:graphic>
-              <a:graphicData uri="http://schemas.openxmlformats.org/drawingml/2006/picture">
-                <pic:pic>
-                  <pic:nvPicPr>
-                    <pic:cNvPr id="0" name="image.png"/>
-                    <pic:cNvPicPr/>
-                  </pic:nvPicPr>
-                  <pic:blipFill>
-                    <a:blip r:embed="rId22"/>
-                    <a:stretch>
-                      <a:fillRect/>
-                    </a:stretch>
-                  </pic:blipFill>
-                  <pic:spPr>
-                    <a:xfrm>
-                      <a:off x="0" y="0"/>
-                      <a:ext cx="2148840" cy="1670723"/>
-                    </a:xfrm>
-                    <a:prstGeom prst="rect"/>
-                  </pic:spPr>
-                </pic:pic>
-              </a:graphicData>
-            </a:graphic>
-          </wp:inline>
-        </w:drawing>
-      </w:r>
-      <w:r>
-        <w:t xml:space="preserve">  </w:t>
-      </w:r>
-      <w:r>
-        <w:drawing>
-          <wp:inline xmlns:a="http://schemas.openxmlformats.org/drawingml/2006/main" xmlns:pic="http://schemas.openxmlformats.org/drawingml/2006/picture">
-            <wp:extent cx="2148840" cy="1630970"/>
-            <wp:docPr id="15" name="Picture 15"/>
-            <wp:cNvGraphicFramePr>
-              <a:graphicFrameLocks noChangeAspect="1"/>
-            </wp:cNvGraphicFramePr>
-            <a:graphic>
-              <a:graphicData uri="http://schemas.openxmlformats.org/drawingml/2006/picture">
-                <pic:pic>
-                  <pic:nvPicPr>
-                    <pic:cNvPr id="0" name="image.png"/>
-                    <pic:cNvPicPr/>
-                  </pic:nvPicPr>
-                  <pic:blipFill>
-                    <a:blip r:embed="rId23"/>
-                    <a:stretch>
-                      <a:fillRect/>
-                    </a:stretch>
-                  </pic:blipFill>
-                  <pic:spPr>
-                    <a:xfrm>
-                      <a:off x="0" y="0"/>
-                      <a:ext cx="2148840" cy="1630970"/>
-                    </a:xfrm>
-                    <a:prstGeom prst="rect"/>
-                  </pic:spPr>
-                </pic:pic>
-              </a:graphicData>
-            </a:graphic>
-          </wp:inline>
-        </w:drawing>
-      </w:r>
-      <w:r>
-        <w:t xml:space="preserve">  </w:t>
-      </w:r>
-    </w:p>
-    <w:p>
-      <w:pPr>
-        <w:jc w:val="center"/>
-      </w:pPr>
-      <w:r>
-        <w:rPr>
-          <w:sz w:val="21"/>
-        </w:rPr>
-        <w:t>Figure 4. The display in operation: the compass page with an arriving message (left) and the status page listing both vehicles, their data ages, batteries, and separation (right).</w:t>
-      </w:r>
-    </w:p>
-    <w:p>
-      <w:pPr>
         <w:spacing w:before="320" w:after="80"/>
       </w:pPr>
       <w:r>
@@ -2790,7 +2700,7 @@
         <w:drawing>
           <wp:inline xmlns:a="http://schemas.openxmlformats.org/drawingml/2006/main" xmlns:pic="http://schemas.openxmlformats.org/drawingml/2006/picture">
             <wp:extent cx="4992624" cy="384048"/>
-            <wp:docPr id="16" name="Picture 16"/>
+            <wp:docPr id="14" name="Picture 14"/>
             <wp:cNvGraphicFramePr>
               <a:graphicFrameLocks noChangeAspect="1"/>
             </wp:cNvGraphicFramePr>
@@ -2802,7 +2712,7 @@
                     <pic:cNvPicPr/>
                   </pic:nvPicPr>
                   <pic:blipFill>
-                    <a:blip r:embed="rId24"/>
+                    <a:blip r:embed="rId22"/>
                     <a:stretch>
                       <a:fillRect/>
                     </a:stretch>
@@ -2837,7 +2747,7 @@
         <w:drawing>
           <wp:inline xmlns:a="http://schemas.openxmlformats.org/drawingml/2006/main" xmlns:pic="http://schemas.openxmlformats.org/drawingml/2006/picture">
             <wp:extent cx="5760720" cy="305737"/>
-            <wp:docPr id="17" name="Picture 17"/>
+            <wp:docPr id="15" name="Picture 15"/>
             <wp:cNvGraphicFramePr>
               <a:graphicFrameLocks noChangeAspect="1"/>
             </wp:cNvGraphicFramePr>
@@ -2849,7 +2759,7 @@
                     <pic:cNvPicPr/>
                   </pic:nvPicPr>
                   <pic:blipFill>
-                    <a:blip r:embed="rId25"/>
+                    <a:blip r:embed="rId23"/>
                     <a:stretch>
                       <a:fillRect/>
                     </a:stretch>
@@ -2884,7 +2794,7 @@
         <w:drawing>
           <wp:inline xmlns:a="http://schemas.openxmlformats.org/drawingml/2006/main" xmlns:pic="http://schemas.openxmlformats.org/drawingml/2006/picture">
             <wp:extent cx="3789273" cy="384048"/>
-            <wp:docPr id="18" name="Picture 18"/>
+            <wp:docPr id="16" name="Picture 16"/>
             <wp:cNvGraphicFramePr>
               <a:graphicFrameLocks noChangeAspect="1"/>
             </wp:cNvGraphicFramePr>
@@ -2896,7 +2806,7 @@
                     <pic:cNvPicPr/>
                   </pic:nvPicPr>
                   <pic:blipFill>
-                    <a:blip r:embed="rId26"/>
+                    <a:blip r:embed="rId24"/>
                     <a:stretch>
                       <a:fillRect/>
                     </a:stretch>
@@ -2931,7 +2841,7 @@
         <w:drawing>
           <wp:inline xmlns:a="http://schemas.openxmlformats.org/drawingml/2006/main" xmlns:pic="http://schemas.openxmlformats.org/drawingml/2006/picture">
             <wp:extent cx="5277231" cy="384048"/>
-            <wp:docPr id="19" name="Picture 19"/>
+            <wp:docPr id="17" name="Picture 17"/>
             <wp:cNvGraphicFramePr>
               <a:graphicFrameLocks noChangeAspect="1"/>
             </wp:cNvGraphicFramePr>
@@ -2943,7 +2853,7 @@
                     <pic:cNvPicPr/>
                   </pic:nvPicPr>
                   <pic:blipFill>
-                    <a:blip r:embed="rId27"/>
+                    <a:blip r:embed="rId25"/>
                     <a:stretch>
                       <a:fillRect/>
                     </a:stretch>
@@ -3578,7 +3488,23 @@
         <w:jc w:val="both"/>
       </w:pPr>
       <w:r>
-        <w:t>Three extensions follow naturally from the architecture. The first is a third node: the protocol already supports many, and the only configuration change is reverting both radios from CLIENT_MUTE to the standard client role so packets relay again, at the airtime cost quantified in Section 6.3. The second is a fixed repeater on high ground for terrain that defeats the direct link, enabled by the same role change, with the Section 5 link budget applying unchanged to each hop. The third is powering radio and display from the ignition circuit, which would retire the battery-death failure class of Section 9.2 entirely. Beyond these, the range characterization of Table 3 would turn the Section 5 model from a design argument into a validated measurement.</w:t>
+        <w:t>With the system built, bench-verified, and validated on the road, the remaining work is consolidation rather than construction. The first part is continued testing. The drive tests of Section 10 established the range envelope on one route on one day; the plan for the remainder of the semester is to keep the pair in regular service, accumulating uptime, message counts, and staleness events under ordinary driving so that the reliability claims rest on weeks of operation rather than on single outings.</w:t>
+      </w:r>
+    </w:p>
+    <w:p>
+      <w:pPr>
+        <w:jc w:val="both"/>
+      </w:pPr>
+      <w:r>
+        <w:t>The second part is documentation for handoff. Two companion documents accompany this report: a Device User Guide, written so that a first-time user can operate both devices without assistance, and a Technical Manual, which records the engineering detail, the provisioning procedures, and the complete failure catalog of Section 9. Both exist in working form today and will be kept current with the firmware through the final demonstration, then delivered with the hardware.</w:t>
+      </w:r>
+    </w:p>
+    <w:p>
+      <w:pPr>
+        <w:jc w:val="both"/>
+      </w:pPr>
+      <w:r>
+        <w:t>The third part is range characterization in terrain the link has not yet seen. Two campaigns are planned. A long open-road test in New Mexico, where flat highway and an unobstructed Fresnel zone remove the obstacles that ended the Section 10 test, should reveal the true maximum of the link beyond the 3.75-mile stale point measured locally. A mountain test in canyon terrain poses the opposite problem, repeated loss of line of sight, and will measure how quickly the pair reacquires each other as the geometry opens and closes. Together the two campaigns bracket the best and worst cases a traveling pair will actually meet, and they turn the Section 5 link budget from a design argument into a validated measurement. The larger architectural extensions that the protocol already supports, a third vehicle, a fixed repeater on high ground, and ignition-circuit power, remain available but are deliberately deferred beyond the semester.</w:t>
       </w:r>
     </w:p>
     <w:p>
@@ -5833,7 +5759,7 @@
                 <w:rFonts w:ascii="Times New Roman" w:hAnsi="Times New Roman"/>
                 <w:sz w:val="20"/>
               </w:rPr>
-              <w:t>13 to 45 ft displayed between two radios on one desk; 41 ft on the session of Figure 4</w:t>
+              <w:t>13 to 45 ft displayed between two radios on one desk; 41 ft in one logged bench session</w:t>
             </w:r>
           </w:p>
         </w:tc>

</xml_diff>

<commit_message>
Canyon test into report Appendix C and manual verification; scar catalog entries 9-10
Co-Authored-By: Claude Fable 5 <noreply@anthropic.com>
</commit_message>
<xml_diff>
--- a/docs/reports/Group9_Technical_Report.docx
+++ b/docs/reports/Group9_Technical_Report.docx
@@ -3504,7 +3504,7 @@
         <w:jc w:val="both"/>
       </w:pPr>
       <w:r>
-        <w:t>The third part is range characterization in terrain the link has not yet seen. Two campaigns are planned. A long open-road test in New Mexico, where flat highway and an unobstructed Fresnel zone remove the obstacles that ended the Section 10 test, should reveal the true maximum of the link beyond the 3.75-mile stale point measured locally. A mountain test in canyon terrain poses the opposite problem, repeated loss of line of sight, and will measure how quickly the pair reacquires each other as the geometry opens and closes. Together the two campaigns bracket the best and worst cases a traveling pair will actually meet, and they turn the Section 5 link budget from a design argument into a validated measurement. The larger architectural extensions that the protocol already supports, a third vehicle, a fixed repeater on high ground, and ignition-circuit power, remain available but are deliberately deferred beyond the semester.</w:t>
+        <w:t>The third part is range characterization beyond the first route, and the harder half is now measured. A canyon campaign run on October 18 in caprock terrain near Canyon, Texas put repeated loss of line of sight between the vehicles: staleness appeared from 1.29 miles behind rock, single packets were still received at 4.28 miles through momentary terrain gaps, and the pair reacquired automatically on return, 54 seconds of age by 2.90 miles and 11 seconds by 1.45 miles (Appendix C). The remaining campaign is a long open-road test in New Mexico, where flat highway and an unobstructed Fresnel zone remove the obstacles that ended the Section 10 test and should reveal the true maximum of the link beyond the 3.75-mile stale point measured locally. Together the two campaigns bracket the best and worst cases a traveling pair will actually meet, and they turn the Section 5 link budget from a design argument into a validated measurement. The larger architectural extensions that the protocol already supports, a third vehicle, a fixed repeater on high ground, and ignition-circuit power, remain available but are deliberately deferred beyond the semester.</w:t>
       </w:r>
     </w:p>
     <w:p>
@@ -6130,6 +6130,138 @@
           </w:p>
         </w:tc>
       </w:tr>
+      <w:tr>
+        <w:tc>
+          <w:tcPr>
+            <w:tcW w:type="dxa" w:w="3120"/>
+          </w:tcPr>
+          <w:p>
+            <w:r>
+              <w:rPr>
+                <w:rFonts w:ascii="Times New Roman" w:hAnsi="Times New Roman"/>
+                <w:sz w:val="20"/>
+              </w:rPr>
+              <w:t>Canyon stale onset</w:t>
+            </w:r>
+          </w:p>
+        </w:tc>
+        <w:tc>
+          <w:tcPr>
+            <w:tcW w:type="dxa" w:w="3120"/>
+          </w:tcPr>
+          <w:p>
+            <w:r>
+              <w:rPr>
+                <w:rFonts w:ascii="Times New Roman" w:hAnsi="Times New Roman"/>
+                <w:sz w:val="20"/>
+              </w:rPr>
+              <w:t>DATA STALE from 1.29 mi with canyon rock between the vehicles; repeated stale events at short range throughout the run</w:t>
+            </w:r>
+          </w:p>
+        </w:tc>
+        <w:tc>
+          <w:tcPr>
+            <w:tcW w:type="dxa" w:w="3120"/>
+          </w:tcPr>
+          <w:p>
+            <w:r>
+              <w:rPr>
+                <w:rFonts w:ascii="Times New Roman" w:hAnsi="Times New Roman"/>
+                <w:sz w:val="20"/>
+              </w:rPr>
+              <w:t>2026-10-18, caprock canyon terrain near Canyon, TX (rim point 34.9098, -101.9176, alt 1102 m); same in-cabin antennas</w:t>
+            </w:r>
+          </w:p>
+        </w:tc>
+      </w:tr>
+      <w:tr>
+        <w:tc>
+          <w:tcPr>
+            <w:tcW w:type="dxa" w:w="3120"/>
+          </w:tcPr>
+          <w:p>
+            <w:r>
+              <w:rPr>
+                <w:rFonts w:ascii="Times New Roman" w:hAnsi="Times New Roman"/>
+                <w:sz w:val="20"/>
+              </w:rPr>
+              <w:t>Canyon intermittency</w:t>
+            </w:r>
+          </w:p>
+        </w:tc>
+        <w:tc>
+          <w:tcPr>
+            <w:tcW w:type="dxa" w:w="3120"/>
+          </w:tcPr>
+          <w:p>
+            <w:r>
+              <w:rPr>
+                <w:rFonts w:ascii="Times New Roman" w:hAnsi="Times New Roman"/>
+                <w:sz w:val="20"/>
+              </w:rPr>
+              <w:t>Displayed age reset from 2 min to 1 min at 4.28 mi: a single packet received through a momentary terrain gap while nominally stale</w:t>
+            </w:r>
+          </w:p>
+        </w:tc>
+        <w:tc>
+          <w:tcPr>
+            <w:tcW w:type="dxa" w:w="3120"/>
+          </w:tcPr>
+          <w:p>
+            <w:r>
+              <w:rPr>
+                <w:rFonts w:ascii="Times New Roman" w:hAnsi="Times New Roman"/>
+                <w:sz w:val="20"/>
+              </w:rPr>
+              <w:t>Line-of-sight, not distance, governs in broken terrain; the link is intermittent rather than binary</w:t>
+            </w:r>
+          </w:p>
+        </w:tc>
+      </w:tr>
+      <w:tr>
+        <w:tc>
+          <w:tcPr>
+            <w:tcW w:type="dxa" w:w="3120"/>
+          </w:tcPr>
+          <w:p>
+            <w:r>
+              <w:rPr>
+                <w:rFonts w:ascii="Times New Roman" w:hAnsi="Times New Roman"/>
+                <w:sz w:val="20"/>
+              </w:rPr>
+              <w:t>Canyon reacquisition</w:t>
+            </w:r>
+          </w:p>
+        </w:tc>
+        <w:tc>
+          <w:tcPr>
+            <w:tcW w:type="dxa" w:w="3120"/>
+          </w:tcPr>
+          <w:p>
+            <w:r>
+              <w:rPr>
+                <w:rFonts w:ascii="Times New Roman" w:hAnsi="Times New Roman"/>
+                <w:sz w:val="20"/>
+              </w:rPr>
+              <w:t>Age 54 s by 2.90 mi inbound, 11 s by 1.45 mi with the partner at 12 o'clock, closing 45 mph; no operator action</w:t>
+            </w:r>
+          </w:p>
+        </w:tc>
+        <w:tc>
+          <w:tcPr>
+            <w:tcW w:type="dxa" w:w="3120"/>
+          </w:tcPr>
+          <w:p>
+            <w:r>
+              <w:rPr>
+                <w:rFonts w:ascii="Times New Roman" w:hAnsi="Times New Roman"/>
+                <w:sz w:val="20"/>
+              </w:rPr>
+              <w:t>Recovery is automatic whenever the geometry reopens; one display ran uptime 1910 to 2789 s across the sequence with no reboot</w:t>
+            </w:r>
+          </w:p>
+        </w:tc>
+      </w:tr>
     </w:tbl>
     <w:p>
       <w:pPr>
@@ -6152,7 +6284,7 @@
         <w:jc w:val="both"/>
       </w:pPr>
       <w:r>
-        <w:t>Two figures tie the record together. The 6 dB desk-range SNR sits 23.5 dB above the -17.5 dB demodulation floor, roughly four distance doublings of reserve by the rule of Section 5, which was the basis for believing the 3 to 5 km design range in advance. The road then agreed: the 2026-10-05 range test measured full health at 5.25 km and the reliable edge by 6.03 km with antennas still inside the vehicles, meeting the top of the design range and exceeding it by about a kilometer. This satisfies the range model check of Table 3, and the in-town versus open-road comparison, 0.5 mi against 3.75 mi on identical hardware, is the 20 dB environmental reserve made directly visible.</w:t>
+        <w:t>Two figures tie the record together. The 6 dB desk-range SNR sits 23.5 dB above the -17.5 dB demodulation floor, roughly four distance doublings of reserve by the rule of Section 5, which was the basis for believing the 3 to 5 km design range in advance. The road then agreed: the 2026-10-05 range test measured full health at 5.25 km and the reliable edge by 6.03 km with antennas still inside the vehicles, meeting the top of the design range and exceeding it by about a kilometer. This satisfies the range model check of Table 3, and the three-environment comparison of stale onset on identical hardware, roughly 0.5 mi in town, 1.29 mi behind canyon rock, and 3.75 mi on open road, is the 20 dB environmental reserve made directly visible: distance is not the variable that breaks the link, blocked line of sight is.</w:t>
       </w:r>
     </w:p>
     <w:p>

</xml_diff>

<commit_message>
Report Appendix C: rim elevation finding and measured range envelope
Co-Authored-By: Claude Fable 5 <noreply@anthropic.com>
</commit_message>
<xml_diff>
--- a/docs/reports/Group9_Technical_Report.docx
+++ b/docs/reports/Group9_Technical_Report.docx
@@ -6262,6 +6262,50 @@
           </w:p>
         </w:tc>
       </w:tr>
+      <w:tr>
+        <w:tc>
+          <w:tcPr>
+            <w:tcW w:type="dxa" w:w="3120"/>
+          </w:tcPr>
+          <w:p>
+            <w:r>
+              <w:rPr>
+                <w:rFonts w:ascii="Times New Roman" w:hAnsi="Times New Roman"/>
+                <w:sz w:val="20"/>
+              </w:rPr>
+              <w:t>Rim elevation effect</w:t>
+            </w:r>
+          </w:p>
+        </w:tc>
+        <w:tc>
+          <w:tcPr>
+            <w:tcW w:type="dxa" w:w="3120"/>
+          </w:tcPr>
+          <w:p>
+            <w:r>
+              <w:rPr>
+                <w:rFonts w:ascii="Times New Roman" w:hAnsi="Times New Roman"/>
+                <w:sz w:val="20"/>
+              </w:rPr>
+              <w:t>With one radio parked on the rim at ~1102 m, line-of-sight stretches stayed live to roughly 4.7 mi, beyond the 3.75 mi flat-ground edge, in the same session that produced stalls from 1.29 mi behind rock</w:t>
+            </w:r>
+          </w:p>
+        </w:tc>
+        <w:tc>
+          <w:tcPr>
+            <w:tcW w:type="dxa" w:w="3120"/>
+          </w:tcPr>
+          <w:p>
+            <w:r>
+              <w:rPr>
+                <w:rFonts w:ascii="Times New Roman" w:hAnsi="Times New Roman"/>
+                <w:sz w:val="20"/>
+              </w:rPr>
+              <w:t>One elevated antenna out-ranged two car-height antennas on open road: antenna height, not transmit power, is the dominant range variable, which is the quantitative case for the fixed-repeater extension of Section 11</w:t>
+            </w:r>
+          </w:p>
+        </w:tc>
+      </w:tr>
     </w:tbl>
     <w:p>
       <w:pPr>
@@ -6284,7 +6328,7 @@
         <w:jc w:val="both"/>
       </w:pPr>
       <w:r>
-        <w:t>Two figures tie the record together. The 6 dB desk-range SNR sits 23.5 dB above the -17.5 dB demodulation floor, roughly four distance doublings of reserve by the rule of Section 5, which was the basis for believing the 3 to 5 km design range in advance. The road then agreed: the 2026-10-05 range test measured full health at 5.25 km and the reliable edge by 6.03 km with antennas still inside the vehicles, meeting the top of the design range and exceeding it by about a kilometer. This satisfies the range model check of Table 3, and the three-environment comparison of stale onset on identical hardware, roughly 0.5 mi in town, 1.29 mi behind canyon rock, and 3.75 mi on open road, is the 20 dB environmental reserve made directly visible: distance is not the variable that breaks the link, blocked line of sight is.</w:t>
+        <w:t>Two figures tie the record together. The 6 dB desk-range SNR sits 23.5 dB above the -17.5 dB demodulation floor, roughly four distance doublings of reserve by the rule of Section 5, which was the basis for believing the 3 to 5 km design range in advance. The road then agreed: the 2026-10-05 range test measured full health at 5.25 km and the reliable edge by 6.03 km with antennas still inside the vehicles, meeting the top of the design range and exceeding it by about a kilometer. This satisfies the range model check of Table 3, and the three-environment comparison of stale onset on identical hardware, roughly 0.5 mi in town, 1.29 mi behind canyon rock, and 3.75 mi on open road, is the 20 dB environmental reserve made directly visible: distance is not the variable that breaks the link, blocked line of sight is. The canyon session also measured the other side of that coin: with one radio elevated on the rim, line-of-sight range stretched to roughly 4.7 mi, past the flat-ground edge, so the full measured envelope of this hardware now spans 0.5 to 4.7 mi with terrain and antenna height as the controlling variables.</w:t>
       </w:r>
     </w:p>
     <w:p>

</xml_diff>

<commit_message>
12-slide canyon deck with real-route animation and demo run-of-show; location corrected to Ceta Canyon across docs
Co-Authored-By: Claude Fable 5 <noreply@anthropic.com>
</commit_message>
<xml_diff>
--- a/docs/reports/Group9_Technical_Report.docx
+++ b/docs/reports/Group9_Technical_Report.docx
@@ -3504,7 +3504,7 @@
         <w:jc w:val="both"/>
       </w:pPr>
       <w:r>
-        <w:t>The third part is range characterization beyond the first route, and the harder half is now measured. A canyon campaign run on October 18 in caprock terrain near Canyon, Texas put repeated loss of line of sight between the vehicles: staleness appeared from 1.29 miles behind rock, single packets were still received at 4.28 miles through momentary terrain gaps, and the pair reacquired automatically on return, 54 seconds of age by 2.90 miles and 11 seconds by 1.45 miles (Appendix C). The remaining campaign is a long open-road test in New Mexico, where flat highway and an unobstructed Fresnel zone remove the obstacles that ended the Section 10 test and should reveal the true maximum of the link beyond the 3.75-mile stale point measured locally. Together the two campaigns bracket the best and worst cases a traveling pair will actually meet, and they turn the Section 5 link budget from a design argument into a validated measurement. The larger architectural extensions that the protocol already supports, a third vehicle, a fixed repeater on high ground, and ignition-circuit power, remain available but are deliberately deferred beyond the semester.</w:t>
+        <w:t>The third part is range characterization beyond the first route, and the harder half is now measured. A canyon campaign run on October 18 at Ceta Canyon, on the Palo Duro escarpment near Happy, Texas put repeated loss of line of sight between the vehicles: staleness appeared from 1.29 miles behind rock, single packets were still received at 4.28 miles through momentary terrain gaps, and the pair reacquired automatically on return, 54 seconds of age by 2.90 miles and 11 seconds by 1.45 miles (Appendix C). The remaining campaign is a long open-road test in New Mexico, where flat highway and an unobstructed Fresnel zone remove the obstacles that ended the Section 10 test and should reveal the true maximum of the link beyond the 3.75-mile stale point measured locally. Together the two campaigns bracket the best and worst cases a traveling pair will actually meet, and they turn the Section 5 link budget from a design argument into a validated measurement. The larger architectural extensions that the protocol already supports, a third vehicle, a fixed repeater on high ground, and ignition-circuit power, remain available but are deliberately deferred beyond the semester.</w:t>
       </w:r>
     </w:p>
     <w:p>
@@ -6169,7 +6169,7 @@
                 <w:rFonts w:ascii="Times New Roman" w:hAnsi="Times New Roman"/>
                 <w:sz w:val="20"/>
               </w:rPr>
-              <w:t>2026-10-18, caprock canyon terrain near Canyon, TX (rim point 34.9098, -101.9176, alt 1102 m); same in-cabin antennas</w:t>
+              <w:t>2026-10-18, Ceta Canyon on the Palo Duro escarpment near Happy, TX; RG at the rim point above Garrison Retreat Lodge, SF down FM 1721 onto the plains; same in-cabin antennas</w:t>
             </w:r>
           </w:p>
         </w:tc>
@@ -6287,7 +6287,7 @@
                 <w:rFonts w:ascii="Times New Roman" w:hAnsi="Times New Roman"/>
                 <w:sz w:val="20"/>
               </w:rPr>
-              <w:t>With one radio parked on the rim at ~1102 m, line-of-sight stretches stayed live to roughly 4.7 mi, beyond the 3.75 mi flat-ground edge, in the same session that produced stalls from 1.29 mi behind rock</w:t>
+              <w:t>With one radio parked on the Ceta Canyon rim at ~1,100 m, line-of-sight stretches stayed live to roughly 4.7 mi, beyond the 3.75 mi flat-ground edge, in the same session that produced stalls from 1.29 mi behind rock</w:t>
             </w:r>
           </w:p>
         </w:tc>

</xml_diff>

<commit_message>
Restore all document assets after scratchpad cleanup; archive full build pipeline in repo
- 14 equations, 2 SX1262 figures (redrawn in color), 23 device screen mocks regenerated
- Manual code blocks now dark syntax-highlighted; guide device diagrams recolored
- build_doc.py verifies image counts so missing assets can never ship silently
- docs/src/ is the durable home for sources, generators, and assets

Co-Authored-By: Claude Fable 5 <noreply@anthropic.com>
</commit_message>
<xml_diff>
--- a/docs/reports/Group9_Technical_Report.docx
+++ b/docs/reports/Group9_Technical_Report.docx
@@ -1075,7 +1075,7 @@
       <w:r>
         <w:drawing>
           <wp:inline xmlns:a="http://schemas.openxmlformats.org/drawingml/2006/main" xmlns:pic="http://schemas.openxmlformats.org/drawingml/2006/picture">
-            <wp:extent cx="5760720" cy="2597259"/>
+            <wp:extent cx="5760720" cy="2897514"/>
             <wp:docPr id="2" name="Picture 2"/>
             <wp:cNvGraphicFramePr>
               <a:graphicFrameLocks noChangeAspect="1"/>
@@ -1096,7 +1096,7 @@
                   <pic:spPr>
                     <a:xfrm>
                       <a:off x="0" y="0"/>
-                      <a:ext cx="5760720" cy="2597259"/>
+                      <a:ext cx="5760720" cy="2897514"/>
                     </a:xfrm>
                     <a:prstGeom prst="rect"/>
                   </pic:spPr>
@@ -1133,7 +1133,7 @@
       <w:r>
         <w:drawing>
           <wp:inline xmlns:a="http://schemas.openxmlformats.org/drawingml/2006/main" xmlns:pic="http://schemas.openxmlformats.org/drawingml/2006/picture">
-            <wp:extent cx="4206240" cy="4166415"/>
+            <wp:extent cx="4206240" cy="3849007"/>
             <wp:docPr id="3" name="Picture 3"/>
             <wp:cNvGraphicFramePr>
               <a:graphicFrameLocks noChangeAspect="1"/>
@@ -1154,7 +1154,7 @@
                   <pic:spPr>
                     <a:xfrm>
                       <a:off x="0" y="0"/>
-                      <a:ext cx="4206240" cy="4166415"/>
+                      <a:ext cx="4206240" cy="3849007"/>
                     </a:xfrm>
                     <a:prstGeom prst="rect"/>
                   </pic:spPr>
@@ -1229,7 +1229,7 @@
       <w:r>
         <w:drawing>
           <wp:inline xmlns:a="http://schemas.openxmlformats.org/drawingml/2006/main" xmlns:pic="http://schemas.openxmlformats.org/drawingml/2006/picture">
-            <wp:extent cx="2332853" cy="384048"/>
+            <wp:extent cx="1752599" cy="384048"/>
             <wp:docPr id="4" name="Picture 4"/>
             <wp:cNvGraphicFramePr>
               <a:graphicFrameLocks noChangeAspect="1"/>
@@ -1250,7 +1250,7 @@
                   <pic:spPr>
                     <a:xfrm>
                       <a:off x="0" y="0"/>
-                      <a:ext cx="2332853" cy="384048"/>
+                      <a:ext cx="1752599" cy="384048"/>
                     </a:xfrm>
                     <a:prstGeom prst="rect"/>
                   </pic:spPr>
@@ -1302,7 +1302,7 @@
       <w:r>
         <w:drawing>
           <wp:inline xmlns:a="http://schemas.openxmlformats.org/drawingml/2006/main" xmlns:pic="http://schemas.openxmlformats.org/drawingml/2006/picture">
-            <wp:extent cx="4050871" cy="384048"/>
+            <wp:extent cx="3756176" cy="384048"/>
             <wp:docPr id="5" name="Picture 5"/>
             <wp:cNvGraphicFramePr>
               <a:graphicFrameLocks noChangeAspect="1"/>
@@ -1323,7 +1323,7 @@
                   <pic:spPr>
                     <a:xfrm>
                       <a:off x="0" y="0"/>
-                      <a:ext cx="4050871" cy="384048"/>
+                      <a:ext cx="3756176" cy="384048"/>
                     </a:xfrm>
                     <a:prstGeom prst="rect"/>
                   </pic:spPr>
@@ -1349,7 +1349,7 @@
       <w:r>
         <w:drawing>
           <wp:inline xmlns:a="http://schemas.openxmlformats.org/drawingml/2006/main" xmlns:pic="http://schemas.openxmlformats.org/drawingml/2006/picture">
-            <wp:extent cx="5760720" cy="320688"/>
+            <wp:extent cx="5760720" cy="266826"/>
             <wp:docPr id="6" name="Picture 6"/>
             <wp:cNvGraphicFramePr>
               <a:graphicFrameLocks noChangeAspect="1"/>
@@ -1370,7 +1370,7 @@
                   <pic:spPr>
                     <a:xfrm>
                       <a:off x="0" y="0"/>
-                      <a:ext cx="5760720" cy="320688"/>
+                      <a:ext cx="5760720" cy="266826"/>
                     </a:xfrm>
                     <a:prstGeom prst="rect"/>
                   </pic:spPr>
@@ -1416,7 +1416,7 @@
       <w:r>
         <w:drawing>
           <wp:inline xmlns:a="http://schemas.openxmlformats.org/drawingml/2006/main" xmlns:pic="http://schemas.openxmlformats.org/drawingml/2006/picture">
-            <wp:extent cx="5760720" cy="314043"/>
+            <wp:extent cx="5760720" cy="237292"/>
             <wp:docPr id="7" name="Picture 7"/>
             <wp:cNvGraphicFramePr>
               <a:graphicFrameLocks noChangeAspect="1"/>
@@ -1437,7 +1437,7 @@
                   <pic:spPr>
                     <a:xfrm>
                       <a:off x="0" y="0"/>
-                      <a:ext cx="5760720" cy="314043"/>
+                      <a:ext cx="5760720" cy="237292"/>
                     </a:xfrm>
                     <a:prstGeom prst="rect"/>
                   </pic:spPr>
@@ -1463,7 +1463,7 @@
       <w:r>
         <w:drawing>
           <wp:inline xmlns:a="http://schemas.openxmlformats.org/drawingml/2006/main" xmlns:pic="http://schemas.openxmlformats.org/drawingml/2006/picture">
-            <wp:extent cx="5760720" cy="258633"/>
+            <wp:extent cx="5760720" cy="192123"/>
             <wp:docPr id="8" name="Picture 8"/>
             <wp:cNvGraphicFramePr>
               <a:graphicFrameLocks noChangeAspect="1"/>
@@ -1484,7 +1484,7 @@
                   <pic:spPr>
                     <a:xfrm>
                       <a:off x="0" y="0"/>
-                      <a:ext cx="5760720" cy="258633"/>
+                      <a:ext cx="5760720" cy="192123"/>
                     </a:xfrm>
                     <a:prstGeom prst="rect"/>
                   </pic:spPr>
@@ -1510,7 +1510,7 @@
       <w:r>
         <w:drawing>
           <wp:inline xmlns:a="http://schemas.openxmlformats.org/drawingml/2006/main" xmlns:pic="http://schemas.openxmlformats.org/drawingml/2006/picture">
-            <wp:extent cx="5760720" cy="343217"/>
+            <wp:extent cx="5760720" cy="273676"/>
             <wp:docPr id="9" name="Picture 9"/>
             <wp:cNvGraphicFramePr>
               <a:graphicFrameLocks noChangeAspect="1"/>
@@ -1531,7 +1531,7 @@
                   <pic:spPr>
                     <a:xfrm>
                       <a:off x="0" y="0"/>
-                      <a:ext cx="5760720" cy="343217"/>
+                      <a:ext cx="5760720" cy="273676"/>
                     </a:xfrm>
                     <a:prstGeom prst="rect"/>
                   </pic:spPr>
@@ -1578,7 +1578,7 @@
       <w:r>
         <w:drawing>
           <wp:inline xmlns:a="http://schemas.openxmlformats.org/drawingml/2006/main" xmlns:pic="http://schemas.openxmlformats.org/drawingml/2006/picture">
-            <wp:extent cx="5696712" cy="384048"/>
+            <wp:extent cx="5760720" cy="267845"/>
             <wp:docPr id="10" name="Picture 10"/>
             <wp:cNvGraphicFramePr>
               <a:graphicFrameLocks noChangeAspect="1"/>
@@ -1599,7 +1599,7 @@
                   <pic:spPr>
                     <a:xfrm>
                       <a:off x="0" y="0"/>
-                      <a:ext cx="5696712" cy="384048"/>
+                      <a:ext cx="5760720" cy="267845"/>
                     </a:xfrm>
                     <a:prstGeom prst="rect"/>
                   </pic:spPr>
@@ -1625,7 +1625,7 @@
       <w:r>
         <w:drawing>
           <wp:inline xmlns:a="http://schemas.openxmlformats.org/drawingml/2006/main" xmlns:pic="http://schemas.openxmlformats.org/drawingml/2006/picture">
-            <wp:extent cx="4508723" cy="384048"/>
+            <wp:extent cx="4709019" cy="384048"/>
             <wp:docPr id="11" name="Picture 11"/>
             <wp:cNvGraphicFramePr>
               <a:graphicFrameLocks noChangeAspect="1"/>
@@ -1646,7 +1646,7 @@
                   <pic:spPr>
                     <a:xfrm>
                       <a:off x="0" y="0"/>
-                      <a:ext cx="4508723" cy="384048"/>
+                      <a:ext cx="4709019" cy="384048"/>
                     </a:xfrm>
                     <a:prstGeom prst="rect"/>
                   </pic:spPr>
@@ -1688,7 +1688,7 @@
       <w:r>
         <w:drawing>
           <wp:inline xmlns:a="http://schemas.openxmlformats.org/drawingml/2006/main" xmlns:pic="http://schemas.openxmlformats.org/drawingml/2006/picture">
-            <wp:extent cx="5363653" cy="384048"/>
+            <wp:extent cx="1767220" cy="384048"/>
             <wp:docPr id="12" name="Picture 12"/>
             <wp:cNvGraphicFramePr>
               <a:graphicFrameLocks noChangeAspect="1"/>
@@ -1709,7 +1709,7 @@
                   <pic:spPr>
                     <a:xfrm>
                       <a:off x="0" y="0"/>
-                      <a:ext cx="5363653" cy="384048"/>
+                      <a:ext cx="1767220" cy="384048"/>
                     </a:xfrm>
                     <a:prstGeom prst="rect"/>
                   </pic:spPr>
@@ -1752,7 +1752,7 @@
       <w:r>
         <w:drawing>
           <wp:inline xmlns:a="http://schemas.openxmlformats.org/drawingml/2006/main" xmlns:pic="http://schemas.openxmlformats.org/drawingml/2006/picture">
-            <wp:extent cx="3529401" cy="384048"/>
+            <wp:extent cx="4313154" cy="384048"/>
             <wp:docPr id="13" name="Picture 13"/>
             <wp:cNvGraphicFramePr>
               <a:graphicFrameLocks noChangeAspect="1"/>
@@ -1773,7 +1773,7 @@
                   <pic:spPr>
                     <a:xfrm>
                       <a:off x="0" y="0"/>
-                      <a:ext cx="3529401" cy="384048"/>
+                      <a:ext cx="4313154" cy="384048"/>
                     </a:xfrm>
                     <a:prstGeom prst="rect"/>
                   </pic:spPr>
@@ -2699,7 +2699,7 @@
       <w:r>
         <w:drawing>
           <wp:inline xmlns:a="http://schemas.openxmlformats.org/drawingml/2006/main" xmlns:pic="http://schemas.openxmlformats.org/drawingml/2006/picture">
-            <wp:extent cx="4992624" cy="384048"/>
+            <wp:extent cx="4491488" cy="384048"/>
             <wp:docPr id="14" name="Picture 14"/>
             <wp:cNvGraphicFramePr>
               <a:graphicFrameLocks noChangeAspect="1"/>
@@ -2720,7 +2720,7 @@
                   <pic:spPr>
                     <a:xfrm>
                       <a:off x="0" y="0"/>
-                      <a:ext cx="4992624" cy="384048"/>
+                      <a:ext cx="4491488" cy="384048"/>
                     </a:xfrm>
                     <a:prstGeom prst="rect"/>
                   </pic:spPr>
@@ -2746,7 +2746,7 @@
       <w:r>
         <w:drawing>
           <wp:inline xmlns:a="http://schemas.openxmlformats.org/drawingml/2006/main" xmlns:pic="http://schemas.openxmlformats.org/drawingml/2006/picture">
-            <wp:extent cx="5760720" cy="305737"/>
+            <wp:extent cx="5760720" cy="244897"/>
             <wp:docPr id="15" name="Picture 15"/>
             <wp:cNvGraphicFramePr>
               <a:graphicFrameLocks noChangeAspect="1"/>
@@ -2767,7 +2767,7 @@
                   <pic:spPr>
                     <a:xfrm>
                       <a:off x="0" y="0"/>
-                      <a:ext cx="5760720" cy="305737"/>
+                      <a:ext cx="5760720" cy="244897"/>
                     </a:xfrm>
                     <a:prstGeom prst="rect"/>
                   </pic:spPr>
@@ -2793,7 +2793,7 @@
       <w:r>
         <w:drawing>
           <wp:inline xmlns:a="http://schemas.openxmlformats.org/drawingml/2006/main" xmlns:pic="http://schemas.openxmlformats.org/drawingml/2006/picture">
-            <wp:extent cx="3789273" cy="384048"/>
+            <wp:extent cx="2562368" cy="384048"/>
             <wp:docPr id="16" name="Picture 16"/>
             <wp:cNvGraphicFramePr>
               <a:graphicFrameLocks noChangeAspect="1"/>
@@ -2814,7 +2814,7 @@
                   <pic:spPr>
                     <a:xfrm>
                       <a:off x="0" y="0"/>
-                      <a:ext cx="3789273" cy="384048"/>
+                      <a:ext cx="2562368" cy="384048"/>
                     </a:xfrm>
                     <a:prstGeom prst="rect"/>
                   </pic:spPr>
@@ -2840,7 +2840,7 @@
       <w:r>
         <w:drawing>
           <wp:inline xmlns:a="http://schemas.openxmlformats.org/drawingml/2006/main" xmlns:pic="http://schemas.openxmlformats.org/drawingml/2006/picture">
-            <wp:extent cx="5277231" cy="384048"/>
+            <wp:extent cx="5429847" cy="384048"/>
             <wp:docPr id="17" name="Picture 17"/>
             <wp:cNvGraphicFramePr>
               <a:graphicFrameLocks noChangeAspect="1"/>
@@ -2861,7 +2861,7 @@
                   <pic:spPr>
                     <a:xfrm>
                       <a:off x="0" y="0"/>
-                      <a:ext cx="5277231" cy="384048"/>
+                      <a:ext cx="5429847" cy="384048"/>
                     </a:xfrm>
                     <a:prstGeom prst="rect"/>
                   </pic:spPr>

</xml_diff>

<commit_message>
Technical manual v2: genuine datasheet figures, rendered architecture diagrams, GitHub-light code, centered 12pt math, sections on new pages, fleet flashing procedure
Co-Authored-By: Claude Fable 5 <noreply@anthropic.com>
</commit_message>
<xml_diff>
--- a/docs/reports/Group9_Technical_Report.docx
+++ b/docs/reports/Group9_Technical_Report.docx
@@ -1075,7 +1075,7 @@
       <w:r>
         <w:drawing>
           <wp:inline xmlns:a="http://schemas.openxmlformats.org/drawingml/2006/main" xmlns:pic="http://schemas.openxmlformats.org/drawingml/2006/picture">
-            <wp:extent cx="5760720" cy="2897514"/>
+            <wp:extent cx="5760720" cy="2970553"/>
             <wp:docPr id="2" name="Picture 2"/>
             <wp:cNvGraphicFramePr>
               <a:graphicFrameLocks noChangeAspect="1"/>
@@ -1096,7 +1096,7 @@
                   <pic:spPr>
                     <a:xfrm>
                       <a:off x="0" y="0"/>
-                      <a:ext cx="5760720" cy="2897514"/>
+                      <a:ext cx="5760720" cy="2970553"/>
                     </a:xfrm>
                     <a:prstGeom prst="rect"/>
                   </pic:spPr>
@@ -1133,7 +1133,7 @@
       <w:r>
         <w:drawing>
           <wp:inline xmlns:a="http://schemas.openxmlformats.org/drawingml/2006/main" xmlns:pic="http://schemas.openxmlformats.org/drawingml/2006/picture">
-            <wp:extent cx="4206240" cy="3849007"/>
+            <wp:extent cx="4206240" cy="4344473"/>
             <wp:docPr id="3" name="Picture 3"/>
             <wp:cNvGraphicFramePr>
               <a:graphicFrameLocks noChangeAspect="1"/>
@@ -1154,7 +1154,7 @@
                   <pic:spPr>
                     <a:xfrm>
                       <a:off x="0" y="0"/>
-                      <a:ext cx="4206240" cy="3849007"/>
+                      <a:ext cx="4206240" cy="4344473"/>
                     </a:xfrm>
                     <a:prstGeom prst="rect"/>
                   </pic:spPr>

</xml_diff>

<commit_message>
Finalize manual and report: uniform 12pt equations, clean figure crop, cover polish
Co-Authored-By: Claude Fable 5 <noreply@anthropic.com>
</commit_message>
<xml_diff>
--- a/docs/reports/Group9_Technical_Report.docx
+++ b/docs/reports/Group9_Technical_Report.docx
@@ -1075,7 +1075,7 @@
       <w:r>
         <w:drawing>
           <wp:inline xmlns:a="http://schemas.openxmlformats.org/drawingml/2006/main" xmlns:pic="http://schemas.openxmlformats.org/drawingml/2006/picture">
-            <wp:extent cx="5760720" cy="2970553"/>
+            <wp:extent cx="5760720" cy="2752344"/>
             <wp:docPr id="2" name="Picture 2"/>
             <wp:cNvGraphicFramePr>
               <a:graphicFrameLocks noChangeAspect="1"/>
@@ -1096,7 +1096,7 @@
                   <pic:spPr>
                     <a:xfrm>
                       <a:off x="0" y="0"/>
-                      <a:ext cx="5760720" cy="2970553"/>
+                      <a:ext cx="5760720" cy="2752344"/>
                     </a:xfrm>
                     <a:prstGeom prst="rect"/>
                   </pic:spPr>

</xml_diff>

<commit_message>
Report references: direct clickable URLs under every citation
Co-Authored-By: Claude Fable 5 <noreply@anthropic.com>
</commit_message>
<xml_diff>
--- a/docs/reports/Group9_Technical_Report.docx
+++ b/docs/reports/Group9_Technical_Report.docx
@@ -3565,7 +3565,10 @@
         <w:t>Nanopb: Protocol Buffers with Small Code Size</w:t>
       </w:r>
       <w:r>
-        <w:t>. GitHub, github.com/nanopb/nanopb.</w:t>
+        <w:t>. GitHub.</w:t>
+      </w:r>
+      <w:r>
+        <w:t>https://github.com/nanopb/nanopb</w:t>
       </w:r>
     </w:p>
     <w:p>
@@ -3589,7 +3592,10 @@
         <w:t>ESP32-S3 Series Datasheet</w:t>
       </w:r>
       <w:r>
-        <w:t>. Version 2.0, Espressif Systems, 2024, www.espressif.com/en/products/socs/esp32-s3.</w:t>
+        <w:t>. Version 2.0, Espressif Systems, 2024.</w:t>
+      </w:r>
+      <w:r>
+        <w:t>https://www.espressif.com/en/products/socs/esp32-s3</w:t>
       </w:r>
     </w:p>
     <w:p>
@@ -3613,7 +3619,10 @@
         <w:t>NimBLE-Arduino: A Fork of the NimBLE Stack for Arduino</w:t>
       </w:r>
       <w:r>
-        <w:t>. GitHub, github.com/h2zero/NimBLE-Arduino.</w:t>
+        <w:t>. GitHub.</w:t>
+      </w:r>
+      <w:r>
+        <w:t>https://github.com/h2zero/NimBLE-Arduino</w:t>
       </w:r>
     </w:p>
     <w:p>
@@ -3637,7 +3646,10 @@
         <w:t>WiFi LoRa 32 (V4) Product Documentation</w:t>
       </w:r>
       <w:r>
-        <w:t>. Heltec Automation, heltec.org/project/wifi-lora-32-v4.</w:t>
+        <w:t>. Heltec Automation.</w:t>
+      </w:r>
+      <w:r>
+        <w:t>https://heltec.org/project/wifi-lora-32-v4/</w:t>
       </w:r>
     </w:p>
     <w:p>
@@ -3661,7 +3673,10 @@
         <w:t>Meshtastic Documentation</w:t>
       </w:r>
       <w:r>
-        <w:t>, meshtastic.org/docs/development/device/client-api.</w:t>
+        <w:t>.</w:t>
+      </w:r>
+      <w:r>
+        <w:t>https://meshtastic.org/docs/development/device/client-api/</w:t>
       </w:r>
     </w:p>
     <w:p>
@@ -3685,7 +3700,10 @@
         <w:t>Meshtastic Documentation</w:t>
       </w:r>
       <w:r>
-        <w:t>, meshtastic.org/docs/overview/encryption.</w:t>
+        <w:t>.</w:t>
+      </w:r>
+      <w:r>
+        <w:t>https://meshtastic.org/docs/overview/encryption/</w:t>
       </w:r>
     </w:p>
     <w:p>
@@ -3709,7 +3727,10 @@
         <w:t>Meshtastic Documentation</w:t>
       </w:r>
       <w:r>
-        <w:t>, meshtastic.org/docs/overview/mesh-algo.</w:t>
+        <w:t>.</w:t>
+      </w:r>
+      <w:r>
+        <w:t>https://meshtastic.org/docs/overview/mesh-algo/</w:t>
       </w:r>
     </w:p>
     <w:p>
@@ -3733,7 +3754,10 @@
         <w:t>Meshtastic Documentation</w:t>
       </w:r>
       <w:r>
-        <w:t>, meshtastic.org/docs/configuration/radio.</w:t>
+        <w:t>.</w:t>
+      </w:r>
+      <w:r>
+        <w:t>https://meshtastic.org/docs/configuration/radio/</w:t>
       </w:r>
     </w:p>
     <w:p>
@@ -3757,7 +3781,10 @@
         <w:t>Meshtastic Device Firmware</w:t>
       </w:r>
       <w:r>
-        <w:t>. Version 2.7.26, GitHub, github.com/meshtastic/firmware.</w:t>
+        <w:t>. Version 2.7.26, GitHub.</w:t>
+      </w:r>
+      <w:r>
+        <w:t>https://github.com/meshtastic/firmware</w:t>
       </w:r>
     </w:p>
     <w:p>
@@ -3781,7 +3808,10 @@
         <w:t>AN1200.13: LoRa Modem Designer's Guide</w:t>
       </w:r>
       <w:r>
-        <w:t>. Semtech Corporation, 2013, www.semtech.com.</w:t>
+        <w:t>. Semtech Corporation, 2013. Hosted copy:</w:t>
+      </w:r>
+      <w:r>
+        <w:t>https://www.mouser.com/pdfdocs/semtech-lora-modem-design.pdf</w:t>
       </w:r>
     </w:p>
     <w:p>
@@ -3805,7 +3835,10 @@
         <w:t>SX1261/2 Long Range, Low Power, Sub-GHz RF Transceiver Datasheet</w:t>
       </w:r>
       <w:r>
-        <w:t>. Revision 2.2, Semtech Corporation, 2023, www.semtech.com/products/wireless-rf/lora-connect/sx1262.</w:t>
+        <w:t>. Revision 2.2, Semtech Corporation.</w:t>
+      </w:r>
+      <w:r>
+        <w:t>https://www.semtech.com/products/wireless-rf/lora-connect/sx1262</w:t>
       </w:r>
     </w:p>
     <w:p>
@@ -3829,7 +3862,10 @@
         <w:t>Code of Federal Regulations</w:t>
       </w:r>
       <w:r>
-        <w:t>, title 47, section 15.247. Electronic Code of Federal Regulations, www.ecfr.gov/current/title-47/section-15.247.</w:t>
+        <w:t>, title 47, section 15.247. Electronic Code of Federal Regulations.</w:t>
+      </w:r>
+      <w:r>
+        <w:t>https://www.ecfr.gov/current/title-47/section-15.247</w:t>
       </w:r>
     </w:p>
     <w:p>
@@ -3853,7 +3889,10 @@
         <w:t>ESP32-S3-RLCD-4.2 Development Board Wiki</w:t>
       </w:r>
       <w:r>
-        <w:t>. Waveshare, www.waveshare.com/wiki/ESP32-S3-RLCD-4.2.</w:t>
+        <w:t>. Waveshare.</w:t>
+      </w:r>
+      <w:r>
+        <w:t>https://www.waveshare.com/wiki/ESP32-S3-RLCD-4.2</w:t>
       </w:r>
     </w:p>
     <w:p>

</xml_diff>